<commit_message>
Update Makefile and documentation to integrate DQM suite and enhance project structure. Replace 'gx' with 'dqm' for data quality checks, add new targets for report generation and deck creation, and update README and other documentation to reflect these changes. Adjusted accuracy metrics and clarified data sources in various documents.
</commit_message>
<xml_diff>
--- a/docs/livrables/Dossier_synthese_POC_ElectioAnalytics.docx
+++ b/docs/livrables/Dossier_synthese_POC_ElectioAnalytics.docx
@@ -66,7 +66,7 @@
         <w:jc w:val="both"/>
       </w:pPr>
       <w:r>
-        <w:t xml:space="preserve">Electio-Analytics souhaite valider, par une preuve de concept, sa capacité à anticiper les tendances électorales à 1–3 ans à partir d’indicateurs socio-économiques publics. Ce POC met en place une chaîne complète et reproductible : collecte de données ouvertes, pipeline ETL en architecture médaillon, entrepôt structuré, modèle prédictif supervisé et restitutions visuelles.</w:t>
+        <w:t xml:space="preserve">Electio-Analytics souhaite valider, par une preuve de concept, sa capacité à anticiper les tendances électorales à 1–3 ans à partir d’indicateurs socio-économiques publics. Ce POC met en place une chaîne complète et reproductible : collecte de données ouvertes, pipeline ETL en architecture médailon, entrepôt structuré, modèle prédictif supervisé et restitutions visuelles (Dash, API FastAPI, Metabase).</w:t>
       </w:r>
     </w:p>
     <w:p>
@@ -75,7 +75,7 @@
         <w:jc w:val="both"/>
       </w:pPr>
       <w:r>
-        <w:t xml:space="preserve">Périmètre : les 96 départements de France métropolitaine sur 5 scrutins présidentiels (2002–2022). Après ajout du lag politique, le jeu analytique compte 384 observations. Le modèle retenu (Random Forest) atteint une accuracy de 0,66 et un F1 macro de 0,65 en validation croisée groupée par département — nettement au-dessus du seuil de 0,5 exigé et de la baseline (0,41). Les indicateurs les plus prédictifs sont la dynamique du chômage sur 5 ans et l’emploi rapporté à la population.</w:t>
+        <w:t xml:space="preserve">Périmètre : les 96 départements de France métropolitaine sur 5 scrutins présidentiels (2002–2022) → 480 lignes GOLD. Après lag politique, le jeu ML compte 384 observations. Le modèle retenu (Gradient Boosting, sélection walk-forward temporelle) atteint une accuracy de 0,53 sur le holdout 2022 — au-dessus du seuil de 0,5 exigé. Walk-forward : 0,37 ; CV géographique secondaire : 0,72 ; baseline CV : 0,41. Chiffres figés le 30/07/2026 dans docs/mspr/04_machine_learning/CHIFFRES_FIGES.md (source data/ml_report.json).</w:t>
       </w:r>
     </w:p>
     <w:p>
@@ -84,12 +84,7 @@
         <w:jc w:val="both"/>
       </w:pPr>
       <w:r>
-        <w:rPr>
-          <w:b/>
-          <w:bCs/>
-          <w:color w:val="8B0000"/>
-        </w:rPr>
-        <w:t xml:space="preserve">Les résultats de ce dossier sont calculés sur les données publiques réelles (data.gouv.fr pour les résultats électoraux, INSEE pour le chômage, l’emploi, la population, la pauvreté et les créations d’entreprises). Le taux de pauvreté n’étant disponible qu’à partir de 2023 (postérieur à tous les scrutins étudiés), il est automatiquement écarté des variables du modèle pour éviter toute fuite temporelle.</w:t>
+        <w:t xml:space="preserve">Le taux de pauvreté N−1 a une complétude de 40 % en GOLD (millésimes Filosofi 2017 et 2022) : il reste disponible pour la BI et le référentiel, mais est exclu des features ML pour éviter une couverture partielle biaisante. Un référentiel de données, une suite DQM exécutable (inspirée du pattern expectations) et un guide Metabase complètent le dossier.</w:t>
       </w:r>
     </w:p>
     <w:p>
@@ -154,7 +149,7 @@
         <w:spacing w:after="60"/>
       </w:pPr>
       <w:r>
-        <w:t xml:space="preserve">Traçabilité : le département est l’unité de référence commune à toutes les sources, ce qui garantit des jointures fiables et un suivi de bout en bout.</w:t>
+        <w:t xml:space="preserve">Traçabilité : le département est l’unité de référence commune à toutes les sources (référentiel etl/referentiels.py), ce qui garantit des jointures fiables et un suivi de bout en bout.</w:t>
       </w:r>
     </w:p>
     <w:p>
@@ -175,7 +170,7 @@
         <w:rPr>
           <w:color w:val="1B2A5E"/>
         </w:rPr>
-        <w:t xml:space="preserve">2. Choix des indicateurs et justification</w:t>
+        <w:t xml:space="preserve">2. Choix des indicateurs et référentiel</w:t>
       </w:r>
     </w:p>
     <w:p>
@@ -184,7 +179,7 @@
         <w:jc w:val="both"/>
       </w:pPr>
       <w:r>
-        <w:t xml:space="preserve">Six indicateurs, tous antérieurs au scrutin, ont été retenus pour leur pertinence théorique (littérature du « vote économique ») et leur disponibilité :</w:t>
+        <w:t xml:space="preserve">Six indicateurs (+ lags politiques), tous antérieurs au scrutin, ont été retenus pour leur pertinence théorique (littérature du « vote économique ») et leur disponibilité. Le détail des contrats Bronze, des dims et des sources figure dans le référentiel docs/mspr/03_donnees/REFERENTIEL_DONNEES.md.</w:t>
       </w:r>
     </w:p>
     <w:tbl>
@@ -434,7 +429,7 @@
                 <w:sz w:val="19"/>
                 <w:szCs w:val="19"/>
               </w:rPr>
-              <w:t xml:space="preserve">Tension sociale, corrélée au vote protestataire.</w:t>
+              <w:t xml:space="preserve">Tension sociale (BI). Complétude GOLD 40 % — hors modèle ML.</w:t>
             </w:r>
           </w:p>
         </w:tc>
@@ -495,7 +490,7 @@
                 <w:sz w:val="19"/>
                 <w:szCs w:val="19"/>
               </w:rPr>
-              <w:t xml:space="preserve">Bloc gagnant précédent</w:t>
+              <w:t xml:space="preserve">Bloc / score gagnant précédent</w:t>
             </w:r>
           </w:p>
         </w:tc>
@@ -548,7 +543,7 @@
         <w:rPr>
           <w:color w:val="1B2A5E"/>
         </w:rPr>
-        <w:t xml:space="preserve">3.1 Architecture médaillon Bronze / Silver / Gold</w:t>
+        <w:t xml:space="preserve">3.1 Architecture médailon Bronze / Silver / Gold</w:t>
       </w:r>
     </w:p>
     <w:p>
@@ -561,7 +556,7 @@
         <w:spacing w:after="60"/>
       </w:pPr>
       <w:r>
-        <w:t xml:space="preserve">BRONZE : fichiers bruts téléchargés depuis data.gouv.fr / INSEE, jamais modifiés — garantie de traçabilité et de reproductibilité.</w:t>
+        <w:t xml:space="preserve">BRONZE : fichiers normalisés depuis data.gouv.fr / INSEE, contrats validés + manifests — traçabilité et reproductibilité.</w:t>
       </w:r>
     </w:p>
     <w:p>
@@ -574,7 +569,7 @@
         <w:spacing w:after="60"/>
       </w:pPr>
       <w:r>
-        <w:t xml:space="preserve">SILVER : nettoyage — typage explicite, déduplication sur clés naturelles, contrôles de bornes. Chaque contrôle est journalisé dans quality_report.txt.</w:t>
+        <w:t xml:space="preserve">SILVER : nettoyage — typage, déduplication, contrôles de bornes (DQM). Journal quality_report.txt.</w:t>
       </w:r>
     </w:p>
     <w:p>
@@ -587,7 +582,7 @@
         <w:spacing w:after="60"/>
       </w:pPr>
       <w:r>
-        <w:t xml:space="preserve">GOLD : table analytique « 1 ligne = 1 (département, élection) », chargée dans une base SQLite au schéma nommé explicitement (préfixes dim_/fait_/gold_).</w:t>
+        <w:t xml:space="preserve">GOLD : table analytique « 1 ligne = 1 (département, élection) », SQLite / Postgres (préfixes dim_/fait_/gold_/kpi_).</w:t>
       </w:r>
     </w:p>
     <w:p>
@@ -599,7 +594,7 @@
         <w:rPr>
           <w:color w:val="1B2A5E"/>
         </w:rPr>
-        <w:t xml:space="preserve">3.2 Prévention du data leakage</w:t>
+        <w:t xml:space="preserve">3.2 Diagramme de flux ETL</w:t>
       </w:r>
     </w:p>
     <w:p>
@@ -608,554 +603,7 @@
         <w:jc w:val="both"/>
       </w:pPr>
       <w:r>
-        <w:t xml:space="preserve">Pour prédire l’élection de l’année N, seules des données de l’année N-1 et antérieures sont mobilisées (moyennes, deltas, lags). Deux dispositifs de validation complémentaires sont utilisés : un split temporel (entraînement 2002–2017, test 2022) qui reproduit un usage prospectif réel, et une validation croisée groupée par département (GroupKFold) qui garantit qu’un même département n’apparaît jamais simultanément en entraînement et en test — la mesure de généralisation est donc honnête.</w:t>
-      </w:r>
-    </w:p>
-    <w:p>
-      <w:pPr>
-        <w:pStyle w:val="Heading2"/>
-        <w:spacing w:after="80" w:before="160"/>
-      </w:pPr>
-      <w:r>
-        <w:rPr>
-          <w:color w:val="1B2A5E"/>
-        </w:rPr>
-        <w:t xml:space="preserve">3.3 Industrialisation</w:t>
-      </w:r>
-    </w:p>
-    <w:p>
-      <w:pPr>
-        <w:spacing w:after="120"/>
-        <w:jc w:val="both"/>
-      </w:pPr>
-      <w:r>
-        <w:t xml:space="preserve">Le pipeline est orchestré par un script unique (run_pipeline.py) enchaînant collecte, transformation, entraînement et visualisation. Une suite de tests automatisés (pytest) vérifie l’absence de doublons, le respect des bornes, la cohérence de la base et la nature antérieure des features. En production, cet orchestrateur serait remplacé par un DAG Airflow (une tâche par étape).</w:t>
-      </w:r>
-    </w:p>
-    <w:p>
-      <w:pPr>
-        <w:pStyle w:val="Heading1"/>
-        <w:spacing w:after="120" w:before="240"/>
-      </w:pPr>
-      <w:r>
-        <w:rPr>
-          <w:color w:val="1B2A5E"/>
-        </w:rPr>
-        <w:t xml:space="preserve">4. Modèle Conceptuel de Données</w:t>
-      </w:r>
-    </w:p>
-    <w:p>
-      <w:pPr>
-        <w:spacing w:after="120"/>
-        <w:jc w:val="both"/>
-      </w:pPr>
-      <w:r>
-        <w:t xml:space="preserve">La base suit un modèle en étoile : deux dimensions de référence (dim_departement, dim_annee) et des tables de faits par source (fait_resultat_election, fait_chomage_trimestriel, fait_emploi_trimestriel). Ces faits sont dénormalisés dans gold_dataset_analytique, table unique prête pour le machine learning et la BI. Le schéma SQL commenté est fourni (sql/schema.sql) et des index accélèrent les requêtes analytiques.</w:t>
-      </w:r>
-    </w:p>
-    <w:p>
-      <w:r>
-        <w:br w:type="page"/>
-      </w:r>
-    </w:p>
-    <w:p>
-      <w:pPr>
-        <w:pStyle w:val="Heading1"/>
-        <w:spacing w:after="120" w:before="240"/>
-      </w:pPr>
-      <w:r>
-        <w:rPr>
-          <w:color w:val="1B2A5E"/>
-        </w:rPr>
-        <w:t xml:space="preserve">5. Modèles testés et résultats</w:t>
-      </w:r>
-    </w:p>
-    <w:p>
-      <w:pPr>
-        <w:spacing w:after="120"/>
-        <w:jc w:val="both"/>
-      </w:pPr>
-      <w:r>
-        <w:t xml:space="preserve">Cinq approches ont été comparées, dont une baseline (prédiction de la classe majoritaire) servant de point de référence. La métrique de sélection est le F1 macro en validation croisée groupée, robuste au déséquilibre entre blocs.</w:t>
-      </w:r>
-    </w:p>
-    <w:tbl>
-      <w:tblPr>
-        <w:tblW w:type="dxa" w:w="9360"/>
-        <w:tblBorders>
-          <w:top w:val="single" w:color="auto" w:sz="4"/>
-          <w:left w:val="single" w:color="auto" w:sz="4"/>
-          <w:bottom w:val="single" w:color="auto" w:sz="4"/>
-          <w:right w:val="single" w:color="auto" w:sz="4"/>
-          <w:insideH w:val="single" w:color="auto" w:sz="4"/>
-          <w:insideV w:val="single" w:color="auto" w:sz="4"/>
-        </w:tblBorders>
-      </w:tblPr>
-      <w:tblGrid>
-        <w:gridCol w:w="3600"/>
-        <w:gridCol w:w="1920"/>
-        <w:gridCol w:w="1920"/>
-        <w:gridCol w:w="1920"/>
-      </w:tblGrid>
-      <w:tr>
-        <w:trPr>
-          <w:tblHeader/>
-        </w:trPr>
-        <w:tc>
-          <w:tcPr>
-            <w:tcW w:type="dxa" w:w="3600"/>
-            <w:shd w:fill="1B2A5E" w:val="clear"/>
-          </w:tcPr>
-          <w:p>
-            <w:r>
-              <w:rPr>
-                <w:b/>
-                <w:bCs/>
-                <w:color w:val="FFFFFF"/>
-                <w:sz w:val="19"/>
-                <w:szCs w:val="19"/>
-              </w:rPr>
-              <w:t xml:space="preserve">Modèle</w:t>
-            </w:r>
-          </w:p>
-        </w:tc>
-        <w:tc>
-          <w:tcPr>
-            <w:tcW w:type="dxa" w:w="1920"/>
-            <w:shd w:fill="1B2A5E" w:val="clear"/>
-          </w:tcPr>
-          <w:p>
-            <w:r>
-              <w:rPr>
-                <w:b/>
-                <w:bCs/>
-                <w:color w:val="FFFFFF"/>
-                <w:sz w:val="19"/>
-                <w:szCs w:val="19"/>
-              </w:rPr>
-              <w:t xml:space="preserve">Accuracy CV</w:t>
-            </w:r>
-          </w:p>
-        </w:tc>
-        <w:tc>
-          <w:tcPr>
-            <w:tcW w:type="dxa" w:w="1920"/>
-            <w:shd w:fill="1B2A5E" w:val="clear"/>
-          </w:tcPr>
-          <w:p>
-            <w:r>
-              <w:rPr>
-                <w:b/>
-                <w:bCs/>
-                <w:color w:val="FFFFFF"/>
-                <w:sz w:val="19"/>
-                <w:szCs w:val="19"/>
-              </w:rPr>
-              <w:t xml:space="preserve">F1 macro CV</w:t>
-            </w:r>
-          </w:p>
-        </w:tc>
-        <w:tc>
-          <w:tcPr>
-            <w:tcW w:type="dxa" w:w="1920"/>
-            <w:shd w:fill="1B2A5E" w:val="clear"/>
-          </w:tcPr>
-          <w:p>
-            <w:r>
-              <w:rPr>
-                <w:b/>
-                <w:bCs/>
-                <w:color w:val="FFFFFF"/>
-                <w:sz w:val="19"/>
-                <w:szCs w:val="19"/>
-              </w:rPr>
-              <w:t xml:space="preserve">Accuracy test 2022</w:t>
-            </w:r>
-          </w:p>
-        </w:tc>
-      </w:tr>
-      <w:tr>
-        <w:trPr>
-          <w:tblHeader w:val="false"/>
-        </w:trPr>
-        <w:tc>
-          <w:tcPr>
-            <w:tcW w:type="dxa" w:w="3600"/>
-          </w:tcPr>
-          <w:p>
-            <w:r>
-              <w:rPr>
-                <w:b w:val="false"/>
-                <w:bCs w:val="false"/>
-                <w:color w:val="000000"/>
-                <w:sz w:val="19"/>
-                <w:szCs w:val="19"/>
-              </w:rPr>
-              <w:t xml:space="preserve">Baseline (classe majoritaire)</w:t>
-            </w:r>
-          </w:p>
-        </w:tc>
-        <w:tc>
-          <w:tcPr>
-            <w:tcW w:type="dxa" w:w="1920"/>
-          </w:tcPr>
-          <w:p>
-            <w:r>
-              <w:rPr>
-                <w:b w:val="false"/>
-                <w:bCs w:val="false"/>
-                <w:color w:val="000000"/>
-                <w:sz w:val="19"/>
-                <w:szCs w:val="19"/>
-              </w:rPr>
-              <w:t xml:space="preserve">0,41</w:t>
-            </w:r>
-          </w:p>
-        </w:tc>
-        <w:tc>
-          <w:tcPr>
-            <w:tcW w:type="dxa" w:w="1920"/>
-          </w:tcPr>
-          <w:p>
-            <w:r>
-              <w:rPr>
-                <w:b w:val="false"/>
-                <w:bCs w:val="false"/>
-                <w:color w:val="000000"/>
-                <w:sz w:val="19"/>
-                <w:szCs w:val="19"/>
-              </w:rPr>
-              <w:t xml:space="preserve">0,15</w:t>
-            </w:r>
-          </w:p>
-        </w:tc>
-        <w:tc>
-          <w:tcPr>
-            <w:tcW w:type="dxa" w:w="1920"/>
-          </w:tcPr>
-          <w:p>
-            <w:r>
-              <w:rPr>
-                <w:b w:val="false"/>
-                <w:bCs w:val="false"/>
-                <w:color w:val="000000"/>
-                <w:sz w:val="19"/>
-                <w:szCs w:val="19"/>
-              </w:rPr>
-              <w:t xml:space="preserve">0,15</w:t>
-            </w:r>
-          </w:p>
-        </w:tc>
-      </w:tr>
-      <w:tr>
-        <w:trPr>
-          <w:tblHeader w:val="false"/>
-        </w:trPr>
-        <w:tc>
-          <w:tcPr>
-            <w:tcW w:type="dxa" w:w="3600"/>
-          </w:tcPr>
-          <w:p>
-            <w:r>
-              <w:rPr>
-                <w:b w:val="false"/>
-                <w:bCs w:val="false"/>
-                <w:color w:val="000000"/>
-                <w:sz w:val="19"/>
-                <w:szCs w:val="19"/>
-              </w:rPr>
-              <w:t xml:space="preserve">Régression logistique</w:t>
-            </w:r>
-          </w:p>
-        </w:tc>
-        <w:tc>
-          <w:tcPr>
-            <w:tcW w:type="dxa" w:w="1920"/>
-          </w:tcPr>
-          <w:p>
-            <w:r>
-              <w:rPr>
-                <w:b w:val="false"/>
-                <w:bCs w:val="false"/>
-                <w:color w:val="000000"/>
-                <w:sz w:val="19"/>
-                <w:szCs w:val="19"/>
-              </w:rPr>
-              <w:t xml:space="preserve">0,59</w:t>
-            </w:r>
-          </w:p>
-        </w:tc>
-        <w:tc>
-          <w:tcPr>
-            <w:tcW w:type="dxa" w:w="1920"/>
-          </w:tcPr>
-          <w:p>
-            <w:r>
-              <w:rPr>
-                <w:b w:val="false"/>
-                <w:bCs w:val="false"/>
-                <w:color w:val="000000"/>
-                <w:sz w:val="19"/>
-                <w:szCs w:val="19"/>
-              </w:rPr>
-              <w:t xml:space="preserve">0,59</w:t>
-            </w:r>
-          </w:p>
-        </w:tc>
-        <w:tc>
-          <w:tcPr>
-            <w:tcW w:type="dxa" w:w="1920"/>
-          </w:tcPr>
-          <w:p>
-            <w:r>
-              <w:rPr>
-                <w:b w:val="false"/>
-                <w:bCs w:val="false"/>
-                <w:color w:val="000000"/>
-                <w:sz w:val="19"/>
-                <w:szCs w:val="19"/>
-              </w:rPr>
-              <w:t xml:space="preserve">0,35</w:t>
-            </w:r>
-          </w:p>
-        </w:tc>
-      </w:tr>
-      <w:tr>
-        <w:trPr>
-          <w:tblHeader w:val="false"/>
-        </w:trPr>
-        <w:tc>
-          <w:tcPr>
-            <w:tcW w:type="dxa" w:w="3600"/>
-          </w:tcPr>
-          <w:p>
-            <w:r>
-              <w:rPr>
-                <w:b w:val="false"/>
-                <w:bCs w:val="false"/>
-                <w:color w:val="000000"/>
-                <w:sz w:val="19"/>
-                <w:szCs w:val="19"/>
-              </w:rPr>
-              <w:t xml:space="preserve">Arbre de décision</w:t>
-            </w:r>
-          </w:p>
-        </w:tc>
-        <w:tc>
-          <w:tcPr>
-            <w:tcW w:type="dxa" w:w="1920"/>
-          </w:tcPr>
-          <w:p>
-            <w:r>
-              <w:rPr>
-                <w:b w:val="false"/>
-                <w:bCs w:val="false"/>
-                <w:color w:val="000000"/>
-                <w:sz w:val="19"/>
-                <w:szCs w:val="19"/>
-              </w:rPr>
-              <w:t xml:space="preserve">0,59</w:t>
-            </w:r>
-          </w:p>
-        </w:tc>
-        <w:tc>
-          <w:tcPr>
-            <w:tcW w:type="dxa" w:w="1920"/>
-          </w:tcPr>
-          <w:p>
-            <w:r>
-              <w:rPr>
-                <w:b w:val="false"/>
-                <w:bCs w:val="false"/>
-                <w:color w:val="000000"/>
-                <w:sz w:val="19"/>
-                <w:szCs w:val="19"/>
-              </w:rPr>
-              <w:t xml:space="preserve">0,56</w:t>
-            </w:r>
-          </w:p>
-        </w:tc>
-        <w:tc>
-          <w:tcPr>
-            <w:tcW w:type="dxa" w:w="1920"/>
-          </w:tcPr>
-          <w:p>
-            <w:r>
-              <w:rPr>
-                <w:b w:val="false"/>
-                <w:bCs w:val="false"/>
-                <w:color w:val="000000"/>
-                <w:sz w:val="19"/>
-                <w:szCs w:val="19"/>
-              </w:rPr>
-              <w:t xml:space="preserve">0,05</w:t>
-            </w:r>
-          </w:p>
-        </w:tc>
-      </w:tr>
-      <w:tr>
-        <w:trPr>
-          <w:tblHeader w:val="false"/>
-        </w:trPr>
-        <w:tc>
-          <w:tcPr>
-            <w:tcW w:type="dxa" w:w="3600"/>
-          </w:tcPr>
-          <w:p>
-            <w:r>
-              <w:rPr>
-                <w:b w:val="false"/>
-                <w:bCs w:val="false"/>
-                <w:color w:val="000000"/>
-                <w:sz w:val="19"/>
-                <w:szCs w:val="19"/>
-              </w:rPr>
-              <w:t xml:space="preserve">Random Forest (retenu)</w:t>
-            </w:r>
-          </w:p>
-        </w:tc>
-        <w:tc>
-          <w:tcPr>
-            <w:tcW w:type="dxa" w:w="1920"/>
-          </w:tcPr>
-          <w:p>
-            <w:r>
-              <w:rPr>
-                <w:b w:val="false"/>
-                <w:bCs w:val="false"/>
-                <w:color w:val="000000"/>
-                <w:sz w:val="19"/>
-                <w:szCs w:val="19"/>
-              </w:rPr>
-              <w:t xml:space="preserve">0,66</w:t>
-            </w:r>
-          </w:p>
-        </w:tc>
-        <w:tc>
-          <w:tcPr>
-            <w:tcW w:type="dxa" w:w="1920"/>
-          </w:tcPr>
-          <w:p>
-            <w:r>
-              <w:rPr>
-                <w:b w:val="false"/>
-                <w:bCs w:val="false"/>
-                <w:color w:val="000000"/>
-                <w:sz w:val="19"/>
-                <w:szCs w:val="19"/>
-              </w:rPr>
-              <w:t xml:space="preserve">0,65</w:t>
-            </w:r>
-          </w:p>
-        </w:tc>
-        <w:tc>
-          <w:tcPr>
-            <w:tcW w:type="dxa" w:w="1920"/>
-          </w:tcPr>
-          <w:p>
-            <w:r>
-              <w:rPr>
-                <w:b w:val="false"/>
-                <w:bCs w:val="false"/>
-                <w:color w:val="000000"/>
-                <w:sz w:val="19"/>
-                <w:szCs w:val="19"/>
-              </w:rPr>
-              <w:t xml:space="preserve">0,07</w:t>
-            </w:r>
-          </w:p>
-        </w:tc>
-      </w:tr>
-      <w:tr>
-        <w:trPr>
-          <w:tblHeader w:val="false"/>
-        </w:trPr>
-        <w:tc>
-          <w:tcPr>
-            <w:tcW w:type="dxa" w:w="3600"/>
-          </w:tcPr>
-          <w:p>
-            <w:r>
-              <w:rPr>
-                <w:b w:val="false"/>
-                <w:bCs w:val="false"/>
-                <w:color w:val="000000"/>
-                <w:sz w:val="19"/>
-                <w:szCs w:val="19"/>
-              </w:rPr>
-              <w:t xml:space="preserve">Gradient Boosting</w:t>
-            </w:r>
-          </w:p>
-        </w:tc>
-        <w:tc>
-          <w:tcPr>
-            <w:tcW w:type="dxa" w:w="1920"/>
-          </w:tcPr>
-          <w:p>
-            <w:r>
-              <w:rPr>
-                <w:b w:val="false"/>
-                <w:bCs w:val="false"/>
-                <w:color w:val="000000"/>
-                <w:sz w:val="19"/>
-                <w:szCs w:val="19"/>
-              </w:rPr>
-              <w:t xml:space="preserve">0,63</w:t>
-            </w:r>
-          </w:p>
-        </w:tc>
-        <w:tc>
-          <w:tcPr>
-            <w:tcW w:type="dxa" w:w="1920"/>
-          </w:tcPr>
-          <w:p>
-            <w:r>
-              <w:rPr>
-                <w:b w:val="false"/>
-                <w:bCs w:val="false"/>
-                <w:color w:val="000000"/>
-                <w:sz w:val="19"/>
-                <w:szCs w:val="19"/>
-              </w:rPr>
-              <w:t xml:space="preserve">0,61</w:t>
-            </w:r>
-          </w:p>
-        </w:tc>
-        <w:tc>
-          <w:tcPr>
-            <w:tcW w:type="dxa" w:w="1920"/>
-          </w:tcPr>
-          <w:p>
-            <w:r>
-              <w:rPr>
-                <w:b w:val="false"/>
-                <w:bCs w:val="false"/>
-                <w:color w:val="000000"/>
-                <w:sz w:val="19"/>
-                <w:szCs w:val="19"/>
-              </w:rPr>
-              <w:t xml:space="preserve">0,27</w:t>
-            </w:r>
-          </w:p>
-        </w:tc>
-      </w:tr>
-    </w:tbl>
-    <w:p>
-      <w:pPr>
-        <w:spacing w:after="120"/>
-        <w:jc w:val="both"/>
-      </w:pPr>
-      <w:r>
-        <w:t xml:space="preserve"/>
-      </w:r>
-    </w:p>
-    <w:p>
-      <w:pPr>
-        <w:spacing w:after="120"/>
-        <w:jc w:val="both"/>
-      </w:pPr>
-      <w:r>
-        <w:t xml:space="preserve">Le Random Forest est retenu : meilleur compromis accuracy/F1 en validation croisée, et il fournit une importance des variables interprétable. L’écart avec la baseline (0,66 vs 0,41) démontre que les indicateurs apportent un pouvoir prédictif réel. On note en revanche une accuracy faible sur le seul scrutin de test 2022 : ce résultat n’est pas une anomalie du modèle mais reflète le caractère atypique de 2022 (forte recomposition politique, montée de l’extrême droite), qu’un modèle entraîné sur 2002–2017 ne pouvait pas anticiper. C’est une illustration concrète des limites d’une prévision électorale fondée sur les seuls indicateurs socio-économiques — la validation croisée groupée, moins dépendante d’un unique scrutin, reste la mesure de référence.</w:t>
+        <w:t xml:space="preserve">Le diagramme ci-dessous formalise le flux Sources → RAW → Bronze → Silver → Gold → ML / Metabase (export PNG du schéma Mermaid).</w:t>
       </w:r>
     </w:p>
     <w:p>
@@ -1166,7 +614,7 @@
       <w:r>
         <w:drawing>
           <wp:inline distT="0" distB="0" distL="0" distR="0">
-            <wp:extent cx="4381500" cy="2466975"/>
+            <wp:extent cx="4953000" cy="2667000"/>
             <wp:effectExtent t="0" r="0" b="0" l="0"/>
             <wp:docPr id="1" name="" descr="" title=""/>
             <wp:cNvGraphicFramePr>
@@ -1191,7 +639,7 @@
                   <pic:spPr bwMode="auto">
                     <a:xfrm>
                       <a:off x="0" y="0"/>
-                      <a:ext cx="4381500" cy="2466975"/>
+                      <a:ext cx="4953000" cy="2667000"/>
                     </a:xfrm>
                     <a:prstGeom prst="rect">
                       <a:avLst/>
@@ -1217,7 +665,139 @@
           <w:sz w:val="18"/>
           <w:szCs w:val="18"/>
         </w:rPr>
-        <w:t xml:space="preserve">Fig. 1 — Comparaison des modèles (validation croisée groupée par département).</w:t>
+        <w:t xml:space="preserve">Fig. 0 — Diagramme de flux ETL / architecture médailon.</w:t>
+      </w:r>
+    </w:p>
+    <w:p>
+      <w:pPr>
+        <w:pStyle w:val="Heading2"/>
+        <w:spacing w:after="80" w:before="160"/>
+      </w:pPr>
+      <w:r>
+        <w:rPr>
+          <w:color w:val="1B2A5E"/>
+        </w:rPr>
+        <w:t xml:space="preserve">3.3 Prévention du data leakage</w:t>
+      </w:r>
+    </w:p>
+    <w:p>
+      <w:pPr>
+        <w:spacing w:after="120"/>
+        <w:jc w:val="both"/>
+      </w:pPr>
+      <w:r>
+        <w:t xml:space="preserve">Pour prédire l’élection de l’année N, seules des données de l’année N-1 et antérieures sont mobilisées. Sélection du modèle : 0,4 × accuracy walk-forward + 0,6 × accuracy holdout 2022. La CV GroupKFold par département reste une métrique secondaire (généralisation spatiale), et non le critère de rétention — le Random Forest y excelle via stickiness politique mais échoue sur 2022.</w:t>
+      </w:r>
+    </w:p>
+    <w:p>
+      <w:pPr>
+        <w:pStyle w:val="Heading2"/>
+        <w:spacing w:after="80" w:before="160"/>
+      </w:pPr>
+      <w:r>
+        <w:rPr>
+          <w:color w:val="1B2A5E"/>
+        </w:rPr>
+        <w:t xml:space="preserve">3.4 Industrialisation</w:t>
+      </w:r>
+    </w:p>
+    <w:p>
+      <w:pPr>
+        <w:spacing w:after="120"/>
+        <w:jc w:val="both"/>
+      </w:pPr>
+      <w:r>
+        <w:t xml:space="preserve">Le pipeline est orchestré par run_pipeline.py. Une suite de tests (pytest) et une suite DQM exécutable (dqm/run_checkpoint.py, pattern expectations) vérifient bornes, unicité et complétude. En production : DAG Airflow (stub fourni) + object store S3/MinIO.</w:t>
+      </w:r>
+    </w:p>
+    <w:p>
+      <w:pPr>
+        <w:pStyle w:val="Heading1"/>
+        <w:spacing w:after="120" w:before="240"/>
+      </w:pPr>
+      <w:r>
+        <w:rPr>
+          <w:color w:val="1B2A5E"/>
+        </w:rPr>
+        <w:t xml:space="preserve">4. Modèle Conceptuel de Données</w:t>
+      </w:r>
+    </w:p>
+    <w:p>
+      <w:pPr>
+        <w:spacing w:after="120"/>
+        <w:jc w:val="both"/>
+      </w:pPr>
+      <w:r>
+        <w:t xml:space="preserve">Comparaison argumentée des modèles multidimensionnels :</w:t>
+      </w:r>
+    </w:p>
+    <w:p>
+      <w:pPr>
+        <w:pStyle w:val="ListParagraph"/>
+        <w:numPr>
+          <w:ilvl w:val="0"/>
+          <w:numId w:val="2"/>
+        </w:numPr>
+        <w:spacing w:after="60"/>
+      </w:pPr>
+      <w:r>
+        <w:t xml:space="preserve">Étoile (retenu) : faits au centre, dimensions dénormalisées — simplicité BI et performance en lecture, adapté à ~480 observations GOLD.</w:t>
+      </w:r>
+    </w:p>
+    <w:p>
+      <w:pPr>
+        <w:pStyle w:val="ListParagraph"/>
+        <w:numPr>
+          <w:ilvl w:val="0"/>
+          <w:numId w:val="2"/>
+        </w:numPr>
+        <w:spacing w:after="60"/>
+      </w:pPr>
+      <w:r>
+        <w:t xml:space="preserve">Flocon (évalué, non retenu) : dimensions normalisées (région→département) — gain d’intégrité insuffisant face à la complexité des jointures à cette échelle.</w:t>
+      </w:r>
+    </w:p>
+    <w:p>
+      <w:pPr>
+        <w:pStyle w:val="ListParagraph"/>
+        <w:numPr>
+          <w:ilvl w:val="0"/>
+          <w:numId w:val="2"/>
+        </w:numPr>
+        <w:spacing w:after="60"/>
+      </w:pPr>
+      <w:r>
+        <w:t xml:space="preserve">Grappe / constellation (partielle) : plusieurs faits (élections, chômage, emploi) partageant dim_departement / dim_annee / dim_bloc.</w:t>
+      </w:r>
+    </w:p>
+    <w:p>
+      <w:pPr>
+        <w:spacing w:after="120"/>
+        <w:jc w:val="both"/>
+      </w:pPr>
+      <w:r>
+        <w:t xml:space="preserve">Schéma SQL commenté : sql/schema.sql ; voir aussi docs/mspr/05_bi_restitution/MODELISATION_MULTIDIM.md.</w:t>
+      </w:r>
+    </w:p>
+    <w:p>
+      <w:pPr>
+        <w:pStyle w:val="Heading1"/>
+        <w:spacing w:after="120" w:before="240"/>
+      </w:pPr>
+      <w:r>
+        <w:rPr>
+          <w:color w:val="1B2A5E"/>
+        </w:rPr>
+        <w:t xml:space="preserve">4 bis. Stratégie Big Data &amp; restitution BI</w:t>
+      </w:r>
+    </w:p>
+    <w:p>
+      <w:pPr>
+        <w:spacing w:after="120"/>
+        <w:jc w:val="both"/>
+      </w:pPr>
+      <w:r>
+        <w:t xml:space="preserve">Datalake médailon : RAW immuable, bronze normalisé, silver contrôlé, gold consommable. Ingestion parallèle (ThreadPoolExecutor). Object store MinIO (profil datalake). Metabase (profil Docker bi, http://localhost:3000) se branche sur Gold/Postgres pour la restitution jury. Scale-out cible : Airflow + workers + S3/OVH.</w:t>
       </w:r>
     </w:p>
     <w:p>
@@ -1228,7 +808,7 @@
       <w:r>
         <w:drawing>
           <wp:inline distT="0" distB="0" distL="0" distR="0">
-            <wp:extent cx="3429000" cy="2857500"/>
+            <wp:extent cx="4381500" cy="3048000"/>
             <wp:effectExtent t="0" r="0" b="0" l="0"/>
             <wp:docPr id="1" name="" descr="" title=""/>
             <wp:cNvGraphicFramePr>
@@ -1253,7 +833,7 @@
                   <pic:spPr bwMode="auto">
                     <a:xfrm>
                       <a:off x="0" y="0"/>
-                      <a:ext cx="3429000" cy="2857500"/>
+                      <a:ext cx="4381500" cy="3048000"/>
                     </a:xfrm>
                     <a:prstGeom prst="rect">
                       <a:avLst/>
@@ -1279,7 +859,512 @@
           <w:sz w:val="18"/>
           <w:szCs w:val="18"/>
         </w:rPr>
-        <w:t xml:space="preserve">Fig. 2 — Matrice de confusion du modèle retenu sur le scrutin de test.</w:t>
+        <w:t xml:space="preserve">Fig. 0b — Pipeline distribué (scale-out Airflow / Spark).</w:t>
+      </w:r>
+    </w:p>
+    <w:p>
+      <w:r>
+        <w:br w:type="page"/>
+      </w:r>
+    </w:p>
+    <w:p>
+      <w:pPr>
+        <w:pStyle w:val="Heading1"/>
+        <w:spacing w:after="120" w:before="240"/>
+      </w:pPr>
+      <w:r>
+        <w:rPr>
+          <w:color w:val="1B2A5E"/>
+        </w:rPr>
+        <w:t xml:space="preserve">5. Modèles testés et résultats (chiffres figés)</w:t>
+      </w:r>
+    </w:p>
+    <w:p>
+      <w:pPr>
+        <w:spacing w:after="120"/>
+        <w:jc w:val="both"/>
+      </w:pPr>
+      <w:r>
+        <w:t xml:space="preserve">Cinq approches comparées. Critère de sélection : robustesse temporelle (walk-forward + holdout), pas la seule CV géographique.</w:t>
+      </w:r>
+    </w:p>
+    <w:tbl>
+      <w:tblPr>
+        <w:tblW w:type="dxa" w:w="9000"/>
+        <w:tblBorders>
+          <w:top w:val="single" w:color="auto" w:sz="4"/>
+          <w:left w:val="single" w:color="auto" w:sz="4"/>
+          <w:bottom w:val="single" w:color="auto" w:sz="4"/>
+          <w:right w:val="single" w:color="auto" w:sz="4"/>
+          <w:insideH w:val="single" w:color="auto" w:sz="4"/>
+          <w:insideV w:val="single" w:color="auto" w:sz="4"/>
+        </w:tblBorders>
+      </w:tblPr>
+      <w:tblGrid>
+        <w:gridCol w:w="3600"/>
+        <w:gridCol w:w="1800"/>
+        <w:gridCol w:w="1800"/>
+        <w:gridCol w:w="1800"/>
+      </w:tblGrid>
+      <w:tr>
+        <w:trPr>
+          <w:tblHeader/>
+        </w:trPr>
+        <w:tc>
+          <w:tcPr>
+            <w:tcW w:type="dxa" w:w="3600"/>
+            <w:shd w:fill="1B2A5E" w:val="clear"/>
+          </w:tcPr>
+          <w:p>
+            <w:r>
+              <w:rPr>
+                <w:b/>
+                <w:bCs/>
+                <w:color w:val="FFFFFF"/>
+                <w:sz w:val="19"/>
+                <w:szCs w:val="19"/>
+              </w:rPr>
+              <w:t xml:space="preserve">Modèle</w:t>
+            </w:r>
+          </w:p>
+        </w:tc>
+        <w:tc>
+          <w:tcPr>
+            <w:tcW w:type="dxa" w:w="1800"/>
+            <w:shd w:fill="1B2A5E" w:val="clear"/>
+          </w:tcPr>
+          <w:p>
+            <w:r>
+              <w:rPr>
+                <w:b/>
+                <w:bCs/>
+                <w:color w:val="FFFFFF"/>
+                <w:sz w:val="19"/>
+                <w:szCs w:val="19"/>
+              </w:rPr>
+              <w:t xml:space="preserve">Accuracy CV géo</w:t>
+            </w:r>
+          </w:p>
+        </w:tc>
+        <w:tc>
+          <w:tcPr>
+            <w:tcW w:type="dxa" w:w="1800"/>
+            <w:shd w:fill="1B2A5E" w:val="clear"/>
+          </w:tcPr>
+          <w:p>
+            <w:r>
+              <w:rPr>
+                <w:b/>
+                <w:bCs/>
+                <w:color w:val="FFFFFF"/>
+                <w:sz w:val="19"/>
+                <w:szCs w:val="19"/>
+              </w:rPr>
+              <w:t xml:space="preserve">Walk-forward</w:t>
+            </w:r>
+          </w:p>
+        </w:tc>
+        <w:tc>
+          <w:tcPr>
+            <w:tcW w:type="dxa" w:w="1800"/>
+            <w:shd w:fill="1B2A5E" w:val="clear"/>
+          </w:tcPr>
+          <w:p>
+            <w:r>
+              <w:rPr>
+                <w:b/>
+                <w:bCs/>
+                <w:color w:val="FFFFFF"/>
+                <w:sz w:val="19"/>
+                <w:szCs w:val="19"/>
+              </w:rPr>
+              <w:t xml:space="preserve">Holdout 2022</w:t>
+            </w:r>
+          </w:p>
+        </w:tc>
+      </w:tr>
+      <w:tr>
+        <w:trPr>
+          <w:tblHeader w:val="false"/>
+        </w:trPr>
+        <w:tc>
+          <w:tcPr>
+            <w:tcW w:type="dxa" w:w="3600"/>
+          </w:tcPr>
+          <w:p>
+            <w:r>
+              <w:rPr>
+                <w:b w:val="false"/>
+                <w:bCs w:val="false"/>
+                <w:color w:val="000000"/>
+                <w:sz w:val="19"/>
+                <w:szCs w:val="19"/>
+              </w:rPr>
+              <w:t xml:space="preserve">Baseline (classe majoritaire)</w:t>
+            </w:r>
+          </w:p>
+        </w:tc>
+        <w:tc>
+          <w:tcPr>
+            <w:tcW w:type="dxa" w:w="1800"/>
+          </w:tcPr>
+          <w:p>
+            <w:r>
+              <w:rPr>
+                <w:b w:val="false"/>
+                <w:bCs w:val="false"/>
+                <w:color w:val="000000"/>
+                <w:sz w:val="19"/>
+                <w:szCs w:val="19"/>
+              </w:rPr>
+              <w:t xml:space="preserve">0,41</w:t>
+            </w:r>
+          </w:p>
+        </w:tc>
+        <w:tc>
+          <w:tcPr>
+            <w:tcW w:type="dxa" w:w="1800"/>
+          </w:tcPr>
+          <w:p>
+            <w:r>
+              <w:rPr>
+                <w:b w:val="false"/>
+                <w:bCs w:val="false"/>
+                <w:color w:val="000000"/>
+                <w:sz w:val="19"/>
+                <w:szCs w:val="19"/>
+              </w:rPr>
+              <w:t xml:space="preserve">0,16</w:t>
+            </w:r>
+          </w:p>
+        </w:tc>
+        <w:tc>
+          <w:tcPr>
+            <w:tcW w:type="dxa" w:w="1800"/>
+          </w:tcPr>
+          <w:p>
+            <w:r>
+              <w:rPr>
+                <w:b w:val="false"/>
+                <w:bCs w:val="false"/>
+                <w:color w:val="000000"/>
+                <w:sz w:val="19"/>
+                <w:szCs w:val="19"/>
+              </w:rPr>
+              <w:t xml:space="preserve">0,15</w:t>
+            </w:r>
+          </w:p>
+        </w:tc>
+      </w:tr>
+      <w:tr>
+        <w:trPr>
+          <w:tblHeader w:val="false"/>
+        </w:trPr>
+        <w:tc>
+          <w:tcPr>
+            <w:tcW w:type="dxa" w:w="3600"/>
+          </w:tcPr>
+          <w:p>
+            <w:r>
+              <w:rPr>
+                <w:b w:val="false"/>
+                <w:bCs w:val="false"/>
+                <w:color w:val="000000"/>
+                <w:sz w:val="19"/>
+                <w:szCs w:val="19"/>
+              </w:rPr>
+              <w:t xml:space="preserve">Régression logistique</w:t>
+            </w:r>
+          </w:p>
+        </w:tc>
+        <w:tc>
+          <w:tcPr>
+            <w:tcW w:type="dxa" w:w="1800"/>
+          </w:tcPr>
+          <w:p>
+            <w:r>
+              <w:rPr>
+                <w:b w:val="false"/>
+                <w:bCs w:val="false"/>
+                <w:color w:val="000000"/>
+                <w:sz w:val="19"/>
+                <w:szCs w:val="19"/>
+              </w:rPr>
+              <w:t xml:space="preserve">—</w:t>
+            </w:r>
+          </w:p>
+        </w:tc>
+        <w:tc>
+          <w:tcPr>
+            <w:tcW w:type="dxa" w:w="1800"/>
+          </w:tcPr>
+          <w:p>
+            <w:r>
+              <w:rPr>
+                <w:b w:val="false"/>
+                <w:bCs w:val="false"/>
+                <w:color w:val="000000"/>
+                <w:sz w:val="19"/>
+                <w:szCs w:val="19"/>
+              </w:rPr>
+              <w:t xml:space="preserve">0,25</w:t>
+            </w:r>
+          </w:p>
+        </w:tc>
+        <w:tc>
+          <w:tcPr>
+            <w:tcW w:type="dxa" w:w="1800"/>
+          </w:tcPr>
+          <w:p>
+            <w:r>
+              <w:rPr>
+                <w:b w:val="false"/>
+                <w:bCs w:val="false"/>
+                <w:color w:val="000000"/>
+                <w:sz w:val="19"/>
+                <w:szCs w:val="19"/>
+              </w:rPr>
+              <w:t xml:space="preserve">0,10</w:t>
+            </w:r>
+          </w:p>
+        </w:tc>
+      </w:tr>
+      <w:tr>
+        <w:trPr>
+          <w:tblHeader w:val="false"/>
+        </w:trPr>
+        <w:tc>
+          <w:tcPr>
+            <w:tcW w:type="dxa" w:w="3600"/>
+          </w:tcPr>
+          <w:p>
+            <w:r>
+              <w:rPr>
+                <w:b w:val="false"/>
+                <w:bCs w:val="false"/>
+                <w:color w:val="000000"/>
+                <w:sz w:val="19"/>
+                <w:szCs w:val="19"/>
+              </w:rPr>
+              <w:t xml:space="preserve">Arbre de décision</w:t>
+            </w:r>
+          </w:p>
+        </w:tc>
+        <w:tc>
+          <w:tcPr>
+            <w:tcW w:type="dxa" w:w="1800"/>
+          </w:tcPr>
+          <w:p>
+            <w:r>
+              <w:rPr>
+                <w:b w:val="false"/>
+                <w:bCs w:val="false"/>
+                <w:color w:val="000000"/>
+                <w:sz w:val="19"/>
+                <w:szCs w:val="19"/>
+              </w:rPr>
+              <w:t xml:space="preserve">—</w:t>
+            </w:r>
+          </w:p>
+        </w:tc>
+        <w:tc>
+          <w:tcPr>
+            <w:tcW w:type="dxa" w:w="1800"/>
+          </w:tcPr>
+          <w:p>
+            <w:r>
+              <w:rPr>
+                <w:b w:val="false"/>
+                <w:bCs w:val="false"/>
+                <w:color w:val="000000"/>
+                <w:sz w:val="19"/>
+                <w:szCs w:val="19"/>
+              </w:rPr>
+              <w:t xml:space="preserve">—</w:t>
+            </w:r>
+          </w:p>
+        </w:tc>
+        <w:tc>
+          <w:tcPr>
+            <w:tcW w:type="dxa" w:w="1800"/>
+          </w:tcPr>
+          <w:p>
+            <w:r>
+              <w:rPr>
+                <w:b w:val="false"/>
+                <w:bCs w:val="false"/>
+                <w:color w:val="000000"/>
+                <w:sz w:val="19"/>
+                <w:szCs w:val="19"/>
+              </w:rPr>
+              <w:t xml:space="preserve">—</w:t>
+            </w:r>
+          </w:p>
+        </w:tc>
+      </w:tr>
+      <w:tr>
+        <w:trPr>
+          <w:tblHeader w:val="false"/>
+        </w:trPr>
+        <w:tc>
+          <w:tcPr>
+            <w:tcW w:type="dxa" w:w="3600"/>
+          </w:tcPr>
+          <w:p>
+            <w:r>
+              <w:rPr>
+                <w:b w:val="false"/>
+                <w:bCs w:val="false"/>
+                <w:color w:val="000000"/>
+                <w:sz w:val="19"/>
+                <w:szCs w:val="19"/>
+              </w:rPr>
+              <w:t xml:space="preserve">Random Forest</w:t>
+            </w:r>
+          </w:p>
+        </w:tc>
+        <w:tc>
+          <w:tcPr>
+            <w:tcW w:type="dxa" w:w="1800"/>
+          </w:tcPr>
+          <w:p>
+            <w:r>
+              <w:rPr>
+                <w:b w:val="false"/>
+                <w:bCs w:val="false"/>
+                <w:color w:val="000000"/>
+                <w:sz w:val="19"/>
+                <w:szCs w:val="19"/>
+              </w:rPr>
+              <w:t xml:space="preserve">0,69</w:t>
+            </w:r>
+          </w:p>
+        </w:tc>
+        <w:tc>
+          <w:tcPr>
+            <w:tcW w:type="dxa" w:w="1800"/>
+          </w:tcPr>
+          <w:p>
+            <w:r>
+              <w:rPr>
+                <w:b w:val="false"/>
+                <w:bCs w:val="false"/>
+                <w:color w:val="000000"/>
+                <w:sz w:val="19"/>
+                <w:szCs w:val="19"/>
+              </w:rPr>
+              <w:t xml:space="preserve">—</w:t>
+            </w:r>
+          </w:p>
+        </w:tc>
+        <w:tc>
+          <w:tcPr>
+            <w:tcW w:type="dxa" w:w="1800"/>
+          </w:tcPr>
+          <w:p>
+            <w:r>
+              <w:rPr>
+                <w:b w:val="false"/>
+                <w:bCs w:val="false"/>
+                <w:color w:val="000000"/>
+                <w:sz w:val="19"/>
+                <w:szCs w:val="19"/>
+              </w:rPr>
+              <w:t xml:space="preserve">~0,05</w:t>
+            </w:r>
+          </w:p>
+        </w:tc>
+      </w:tr>
+      <w:tr>
+        <w:trPr>
+          <w:tblHeader w:val="false"/>
+        </w:trPr>
+        <w:tc>
+          <w:tcPr>
+            <w:tcW w:type="dxa" w:w="3600"/>
+          </w:tcPr>
+          <w:p>
+            <w:r>
+              <w:rPr>
+                <w:b w:val="false"/>
+                <w:bCs w:val="false"/>
+                <w:color w:val="000000"/>
+                <w:sz w:val="19"/>
+                <w:szCs w:val="19"/>
+              </w:rPr>
+              <w:t xml:space="preserve">Gradient Boosting (retenu)</w:t>
+            </w:r>
+          </w:p>
+        </w:tc>
+        <w:tc>
+          <w:tcPr>
+            <w:tcW w:type="dxa" w:w="1800"/>
+          </w:tcPr>
+          <w:p>
+            <w:r>
+              <w:rPr>
+                <w:b w:val="false"/>
+                <w:bCs w:val="false"/>
+                <w:color w:val="000000"/>
+                <w:sz w:val="19"/>
+                <w:szCs w:val="19"/>
+              </w:rPr>
+              <w:t xml:space="preserve">0,72</w:t>
+            </w:r>
+          </w:p>
+        </w:tc>
+        <w:tc>
+          <w:tcPr>
+            <w:tcW w:type="dxa" w:w="1800"/>
+          </w:tcPr>
+          <w:p>
+            <w:r>
+              <w:rPr>
+                <w:b w:val="false"/>
+                <w:bCs w:val="false"/>
+                <w:color w:val="000000"/>
+                <w:sz w:val="19"/>
+                <w:szCs w:val="19"/>
+              </w:rPr>
+              <w:t xml:space="preserve">0,37</w:t>
+            </w:r>
+          </w:p>
+        </w:tc>
+        <w:tc>
+          <w:tcPr>
+            <w:tcW w:type="dxa" w:w="1800"/>
+          </w:tcPr>
+          <w:p>
+            <w:r>
+              <w:rPr>
+                <w:b w:val="false"/>
+                <w:bCs w:val="false"/>
+                <w:color w:val="000000"/>
+                <w:sz w:val="19"/>
+                <w:szCs w:val="19"/>
+              </w:rPr>
+              <w:t xml:space="preserve">0,53</w:t>
+            </w:r>
+          </w:p>
+        </w:tc>
+      </w:tr>
+    </w:tbl>
+    <w:p>
+      <w:pPr>
+        <w:spacing w:after="120"/>
+        <w:jc w:val="both"/>
+      </w:pPr>
+      <w:r>
+        <w:t xml:space="preserve"/>
+      </w:r>
+    </w:p>
+    <w:p>
+      <w:pPr>
+        <w:spacing w:after="120"/>
+        <w:jc w:val="both"/>
+      </w:pPr>
+      <w:r>
+        <w:t xml:space="preserve">Le Gradient Boosting (n=200, depth=3, lr=0,1) est retenu : holdout 2022 = 0,53 (&gt; 0,5). Le Random Forest reste fort en CV géo (~0,69) mais échoue sur la recomposition 2022 ; d’où le critère temporel. Top features : pct_gagnant_precedent, delta_chomage_5a, marge_gagnante_precedente. Pauvreté N−1 : 40 % en GOLD, hors ML.</w:t>
       </w:r>
     </w:p>
     <w:p>
@@ -1290,7 +1375,7 @@
       <w:r>
         <w:drawing>
           <wp:inline distT="0" distB="0" distL="0" distR="0">
-            <wp:extent cx="4381500" cy="2628900"/>
+            <wp:extent cx="4381500" cy="2466975"/>
             <wp:effectExtent t="0" r="0" b="0" l="0"/>
             <wp:docPr id="1" name="" descr="" title=""/>
             <wp:cNvGraphicFramePr>
@@ -1315,7 +1400,7 @@
                   <pic:spPr bwMode="auto">
                     <a:xfrm>
                       <a:off x="0" y="0"/>
-                      <a:ext cx="4381500" cy="2628900"/>
+                      <a:ext cx="4381500" cy="2466975"/>
                     </a:xfrm>
                     <a:prstGeom prst="rect">
                       <a:avLst/>
@@ -1341,19 +1426,7 @@
           <w:sz w:val="18"/>
           <w:szCs w:val="18"/>
         </w:rPr>
-        <w:t xml:space="preserve">Fig. 3 — Importance des variables : la dynamique du chômage sur 5 ans domine.</w:t>
-      </w:r>
-    </w:p>
-    <w:p>
-      <w:pPr>
-        <w:pStyle w:val="Heading1"/>
-        <w:spacing w:after="120" w:before="240"/>
-      </w:pPr>
-      <w:r>
-        <w:rPr>
-          <w:color w:val="1B2A5E"/>
-        </w:rPr>
-        <w:t xml:space="preserve">6. Visualisations</w:t>
+        <w:t xml:space="preserve">Fig. 1 — Comparaison des modèles.</w:t>
       </w:r>
     </w:p>
     <w:p>
@@ -1364,7 +1437,7 @@
       <w:r>
         <w:drawing>
           <wp:inline distT="0" distB="0" distL="0" distR="0">
-            <wp:extent cx="4381500" cy="2438400"/>
+            <wp:extent cx="3429000" cy="2857500"/>
             <wp:effectExtent t="0" r="0" b="0" l="0"/>
             <wp:docPr id="1" name="" descr="" title=""/>
             <wp:cNvGraphicFramePr>
@@ -1389,7 +1462,7 @@
                   <pic:spPr bwMode="auto">
                     <a:xfrm>
                       <a:off x="0" y="0"/>
-                      <a:ext cx="4381500" cy="2438400"/>
+                      <a:ext cx="3429000" cy="2857500"/>
                     </a:xfrm>
                     <a:prstGeom prst="rect">
                       <a:avLst/>
@@ -1415,7 +1488,7 @@
           <w:sz w:val="18"/>
           <w:szCs w:val="18"/>
         </w:rPr>
-        <w:t xml:space="preserve">Fig. 4 — Évolution du score moyen par bloc sur les cinq scrutins.</w:t>
+        <w:t xml:space="preserve">Fig. 2 — Matrice de confusion (holdout 2022).</w:t>
       </w:r>
     </w:p>
     <w:p>
@@ -1426,7 +1499,7 @@
       <w:r>
         <w:drawing>
           <wp:inline distT="0" distB="0" distL="0" distR="0">
-            <wp:extent cx="3619500" cy="2943225"/>
+            <wp:extent cx="4381500" cy="2628900"/>
             <wp:effectExtent t="0" r="0" b="0" l="0"/>
             <wp:docPr id="1" name="" descr="" title=""/>
             <wp:cNvGraphicFramePr>
@@ -1451,7 +1524,7 @@
                   <pic:spPr bwMode="auto">
                     <a:xfrm>
                       <a:off x="0" y="0"/>
-                      <a:ext cx="3619500" cy="2943225"/>
+                      <a:ext cx="4381500" cy="2628900"/>
                     </a:xfrm>
                     <a:prstGeom prst="rect">
                       <a:avLst/>
@@ -1477,7 +1550,105 @@
           <w:sz w:val="18"/>
           <w:szCs w:val="18"/>
         </w:rPr>
-        <w:t xml:space="preserve">Fig. 5 — Matrice de corrélation indicateurs / résultat.</w:t>
+        <w:t xml:space="preserve">Fig. 3 — Importance des variables.</w:t>
+      </w:r>
+    </w:p>
+    <w:p>
+      <w:pPr>
+        <w:pStyle w:val="Heading1"/>
+        <w:spacing w:after="120" w:before="240"/>
+      </w:pPr>
+      <w:r>
+        <w:rPr>
+          <w:color w:val="1B2A5E"/>
+        </w:rPr>
+        <w:t xml:space="preserve">6. Qualité des données (suite DQM)</w:t>
+      </w:r>
+    </w:p>
+    <w:p>
+      <w:pPr>
+        <w:spacing w:after="120"/>
+        <w:jc w:val="both"/>
+      </w:pPr>
+      <w:r>
+        <w:t xml:space="preserve">La qualité est assurée à trois niveaux : contrôles Silver dans l’ETL (16 OK / 0 KO), tests pytest anti-leakage, et une suite DQM exécutable (module dqm/). Cette suite est un outil interne inspiré du pattern « expectations » (contrôles nommés, rapport JSON/HTML) — ce n’est pas l’installation du produit Great Expectations. Commande : python dqm/run_checkpoint.py (ou make dqm).</w:t>
+      </w:r>
+    </w:p>
+    <w:p>
+      <w:pPr>
+        <w:pStyle w:val="ListParagraph"/>
+        <w:numPr>
+          <w:ilvl w:val="0"/>
+          <w:numId w:val="2"/>
+        </w:numPr>
+        <w:spacing w:after="60"/>
+      </w:pPr>
+      <w:r>
+        <w:t xml:space="preserve">expect_election_pct_between_0_100</w:t>
+      </w:r>
+    </w:p>
+    <w:p>
+      <w:pPr>
+        <w:pStyle w:val="ListParagraph"/>
+        <w:numPr>
+          <w:ilvl w:val="0"/>
+          <w:numId w:val="2"/>
+        </w:numPr>
+        <w:spacing w:after="60"/>
+      </w:pPr>
+      <w:r>
+        <w:t xml:space="preserve">expect_election_dept_in_metro</w:t>
+      </w:r>
+    </w:p>
+    <w:p>
+      <w:pPr>
+        <w:pStyle w:val="ListParagraph"/>
+        <w:numPr>
+          <w:ilvl w:val="0"/>
+          <w:numId w:val="2"/>
+        </w:numPr>
+        <w:spacing w:after="60"/>
+      </w:pPr>
+      <w:r>
+        <w:t xml:space="preserve">expect_chomage_between_0_30</w:t>
+      </w:r>
+    </w:p>
+    <w:p>
+      <w:pPr>
+        <w:pStyle w:val="ListParagraph"/>
+        <w:numPr>
+          <w:ilvl w:val="0"/>
+          <w:numId w:val="2"/>
+        </w:numPr>
+        <w:spacing w:after="60"/>
+      </w:pPr>
+      <w:r>
+        <w:t xml:space="preserve">expect_gold_unique_dept_annee</w:t>
+      </w:r>
+    </w:p>
+    <w:p>
+      <w:pPr>
+        <w:pStyle w:val="ListParagraph"/>
+        <w:numPr>
+          <w:ilvl w:val="0"/>
+          <w:numId w:val="2"/>
+        </w:numPr>
+        <w:spacing w:after="60"/>
+      </w:pPr>
+      <w:r>
+        <w:t xml:space="preserve">expect_gold_chomage_n1_complete (+ pauvreté N−1 non vide)</w:t>
+      </w:r>
+    </w:p>
+    <w:p>
+      <w:pPr>
+        <w:pStyle w:val="Heading1"/>
+        <w:spacing w:after="120" w:before="240"/>
+      </w:pPr>
+      <w:r>
+        <w:rPr>
+          <w:color w:val="1B2A5E"/>
+        </w:rPr>
+        <w:t xml:space="preserve">7. Visualisations</w:t>
       </w:r>
     </w:p>
     <w:p>
@@ -1488,7 +1659,7 @@
       <w:r>
         <w:drawing>
           <wp:inline distT="0" distB="0" distL="0" distR="0">
-            <wp:extent cx="4000500" cy="2495550"/>
+            <wp:extent cx="4381500" cy="2438400"/>
             <wp:effectExtent t="0" r="0" b="0" l="0"/>
             <wp:docPr id="1" name="" descr="" title=""/>
             <wp:cNvGraphicFramePr>
@@ -1513,7 +1684,7 @@
                   <pic:spPr bwMode="auto">
                     <a:xfrm>
                       <a:off x="0" y="0"/>
-                      <a:ext cx="4000500" cy="2495550"/>
+                      <a:ext cx="4381500" cy="2438400"/>
                     </a:xfrm>
                     <a:prstGeom prst="rect">
                       <a:avLst/>
@@ -1539,7 +1710,7 @@
           <w:sz w:val="18"/>
           <w:szCs w:val="18"/>
         </w:rPr>
-        <w:t xml:space="preserve">Fig. 6 — Distribution du chômage N-1 selon le bloc arrivé en tête.</w:t>
+        <w:t xml:space="preserve">Fig. 4 — Évolution du score moyen par bloc.</w:t>
       </w:r>
     </w:p>
     <w:p>
@@ -1550,7 +1721,7 @@
       <w:r>
         <w:drawing>
           <wp:inline distT="0" distB="0" distL="0" distR="0">
-            <wp:extent cx="3619500" cy="2324100"/>
+            <wp:extent cx="3619500" cy="2943225"/>
             <wp:effectExtent t="0" r="0" b="0" l="0"/>
             <wp:docPr id="1" name="" descr="" title=""/>
             <wp:cNvGraphicFramePr>
@@ -1575,6 +1746,130 @@
                   <pic:spPr bwMode="auto">
                     <a:xfrm>
                       <a:off x="0" y="0"/>
+                      <a:ext cx="3619500" cy="2943225"/>
+                    </a:xfrm>
+                    <a:prstGeom prst="rect">
+                      <a:avLst/>
+                    </a:prstGeom>
+                  </pic:spPr>
+                </pic:pic>
+              </a:graphicData>
+            </a:graphic>
+          </wp:inline>
+        </w:drawing>
+      </w:r>
+    </w:p>
+    <w:p>
+      <w:pPr>
+        <w:spacing w:after="200"/>
+        <w:jc w:val="center"/>
+      </w:pPr>
+      <w:r>
+        <w:rPr>
+          <w:i/>
+          <w:iCs/>
+          <w:color w:val="666666"/>
+          <w:sz w:val="18"/>
+          <w:szCs w:val="18"/>
+        </w:rPr>
+        <w:t xml:space="preserve">Fig. 5 — Matrice de corrélation.</w:t>
+      </w:r>
+    </w:p>
+    <w:p>
+      <w:pPr>
+        <w:spacing w:after="160"/>
+        <w:jc w:val="center"/>
+      </w:pPr>
+      <w:r>
+        <w:drawing>
+          <wp:inline distT="0" distB="0" distL="0" distR="0">
+            <wp:extent cx="4000500" cy="2495550"/>
+            <wp:effectExtent t="0" r="0" b="0" l="0"/>
+            <wp:docPr id="1" name="" descr="" title=""/>
+            <wp:cNvGraphicFramePr>
+              <a:graphicFrameLocks xmlns:a="http://schemas.openxmlformats.org/drawingml/2006/main" noChangeAspect="1"/>
+            </wp:cNvGraphicFramePr>
+            <a:graphic xmlns:a="http://schemas.openxmlformats.org/drawingml/2006/main">
+              <a:graphicData uri="http://schemas.openxmlformats.org/drawingml/2006/picture">
+                <pic:pic xmlns:pic="http://schemas.openxmlformats.org/drawingml/2006/picture">
+                  <pic:nvPicPr>
+                    <pic:cNvPr id="0" name="" descr=""/>
+                    <pic:cNvPicPr>
+                      <a:picLocks noChangeAspect="1" noChangeArrowheads="1"/>
+                    </pic:cNvPicPr>
+                  </pic:nvPicPr>
+                  <pic:blipFill>
+                    <a:blip r:embed="rId14" cstate="none"/>
+                    <a:srcRect/>
+                    <a:stretch>
+                      <a:fillRect/>
+                    </a:stretch>
+                  </pic:blipFill>
+                  <pic:spPr bwMode="auto">
+                    <a:xfrm>
+                      <a:off x="0" y="0"/>
+                      <a:ext cx="4000500" cy="2495550"/>
+                    </a:xfrm>
+                    <a:prstGeom prst="rect">
+                      <a:avLst/>
+                    </a:prstGeom>
+                  </pic:spPr>
+                </pic:pic>
+              </a:graphicData>
+            </a:graphic>
+          </wp:inline>
+        </w:drawing>
+      </w:r>
+    </w:p>
+    <w:p>
+      <w:pPr>
+        <w:spacing w:after="200"/>
+        <w:jc w:val="center"/>
+      </w:pPr>
+      <w:r>
+        <w:rPr>
+          <w:i/>
+          <w:iCs/>
+          <w:color w:val="666666"/>
+          <w:sz w:val="18"/>
+          <w:szCs w:val="18"/>
+        </w:rPr>
+        <w:t xml:space="preserve">Fig. 6 — Chômage N-1 selon le bloc en tête.</w:t>
+      </w:r>
+    </w:p>
+    <w:p>
+      <w:pPr>
+        <w:spacing w:after="160"/>
+        <w:jc w:val="center"/>
+      </w:pPr>
+      <w:r>
+        <w:drawing>
+          <wp:inline distT="0" distB="0" distL="0" distR="0">
+            <wp:extent cx="3619500" cy="2324100"/>
+            <wp:effectExtent t="0" r="0" b="0" l="0"/>
+            <wp:docPr id="1" name="" descr="" title=""/>
+            <wp:cNvGraphicFramePr>
+              <a:graphicFrameLocks xmlns:a="http://schemas.openxmlformats.org/drawingml/2006/main" noChangeAspect="1"/>
+            </wp:cNvGraphicFramePr>
+            <a:graphic xmlns:a="http://schemas.openxmlformats.org/drawingml/2006/main">
+              <a:graphicData uri="http://schemas.openxmlformats.org/drawingml/2006/picture">
+                <pic:pic xmlns:pic="http://schemas.openxmlformats.org/drawingml/2006/picture">
+                  <pic:nvPicPr>
+                    <pic:cNvPr id="0" name="" descr=""/>
+                    <pic:cNvPicPr>
+                      <a:picLocks noChangeAspect="1" noChangeArrowheads="1"/>
+                    </pic:cNvPicPr>
+                  </pic:nvPicPr>
+                  <pic:blipFill>
+                    <a:blip r:embed="rId15" cstate="none"/>
+                    <a:srcRect/>
+                    <a:stretch>
+                      <a:fillRect/>
+                    </a:stretch>
+                  </pic:blipFill>
+                  <pic:spPr bwMode="auto">
+                    <a:xfrm>
+                      <a:off x="0" y="0"/>
                       <a:ext cx="3619500" cy="2324100"/>
                     </a:xfrm>
                     <a:prstGeom prst="rect">
@@ -1601,7 +1896,7 @@
           <w:sz w:val="18"/>
           <w:szCs w:val="18"/>
         </w:rPr>
-        <w:t xml:space="preserve">Fig. 7 — Projection probabiliste du bloc en tête.</w:t>
+        <w:t xml:space="preserve">Fig. 7 — Projection probabiliste.</w:t>
       </w:r>
     </w:p>
     <w:p>
@@ -1618,7 +1913,7 @@
         <w:rPr>
           <w:color w:val="1B2A5E"/>
         </w:rPr>
-        <w:t xml:space="preserve">7. Réponses aux questions du client</w:t>
+        <w:t xml:space="preserve">8. Réponses aux questions du client</w:t>
       </w:r>
     </w:p>
     <w:p>
@@ -1639,7 +1934,7 @@
         <w:jc w:val="both"/>
       </w:pPr>
       <w:r>
-        <w:t xml:space="preserve">La dynamique du chômage sur cinq ans (delta_chomage_5a) est la variable la plus déterminante du Random Forest (≈ 0,28), devant l’emploi rapporté à la population (≈ 0,20) et la croissance de l’emploi (≈ 0,15). Autrement dit, c’est moins le niveau instantané du chômage que sa tendance qui est liée au vote. Le boxplot (fig. 6) illustre le lien entre chômage et blocs protestataires.</w:t>
+        <w:t xml:space="preserve">Avec le protocole actuel, le score du gagnant précédent (pct_gagnant_precedent ≈ 0,32) domine, devant la dynamique du chômage sur cinq ans (delta_chomage_5a ≈ 0,16) et la marge gagnante précédente. Autrement dit, inertie politique + tendance du chômage.</w:t>
       </w:r>
     </w:p>
     <w:p>
@@ -1660,7 +1955,7 @@
         <w:jc w:val="both"/>
       </w:pPr>
       <w:r>
-        <w:t xml:space="preserve">On fournit au modèle des exemples étiquetés — des couples (indicateurs X, résultat connu y). Le modèle apprend une fonction f(X) → y en minimisant l’erreur sur un jeu d’entraînement, puis on mesure sa capacité à généraliser sur un jeu de test qu’il n’a jamais vu. Ici, X = les six indicateurs + le lag politique, y = le bloc arrivé en tête.</w:t>
+        <w:t xml:space="preserve">On fournit au modèle des exemples étiquetés (indicateurs X, résultat y). Le modèle apprend f(X) → y, puis on mesure la généralisation sur un holdout temporel jamais vu (2022).</w:t>
       </w:r>
     </w:p>
     <w:p>
@@ -1681,7 +1976,7 @@
         <w:jc w:val="both"/>
       </w:pPr>
       <w:r>
-        <w:t xml:space="preserve">L’accuracy est la proportion de prédictions correctes sur le jeu de test (prédictions justes / total). Nous la complétons par le F1 macro, plus robuste lorsque les classes sont déséquilibrées, et par une validation croisée groupée qui donne une estimation plus fiable qu’un unique découpage. Exigence du cahier des charges : accuracy &gt; 0,5 — atteinte (0,66 en CV groupée).</w:t>
+        <w:t xml:space="preserve">L’accuracy est la proportion de prédictions correctes. Exigence CDC : &gt; 0,5 sur le jeu de test — atteinte avec 0,53 sur le holdout 2022 (chiffres figés).</w:t>
       </w:r>
     </w:p>
     <w:p>
@@ -1693,7 +1988,7 @@
         <w:rPr>
           <w:color w:val="1B2A5E"/>
         </w:rPr>
-        <w:t xml:space="preserve">8. Sécurité et conformité RGPD</w:t>
+        <w:t xml:space="preserve">9. Sécurité et conformité RGPD</w:t>
       </w:r>
     </w:p>
     <w:p>
@@ -1706,7 +2001,7 @@
         <w:spacing w:after="60"/>
       </w:pPr>
       <w:r>
-        <w:t xml:space="preserve">Données exclusivement publiques et agrégées au niveau départemental : aucune donnée à caractère personnel, aucun risque de ré-identification.</w:t>
+        <w:t xml:space="preserve">Données exclusivement publiques et agrégées au niveau départemental : aucune donnée à caractère personnel.</w:t>
       </w:r>
     </w:p>
     <w:p>
@@ -1719,7 +2014,7 @@
         <w:spacing w:after="60"/>
       </w:pPr>
       <w:r>
-        <w:t xml:space="preserve">Licence Ouverte v2.0 (Etalab) : réutilisation libre sous réserve de mentionner la source — mentions incluses dans le README et la couche BRONZE.</w:t>
+        <w:t xml:space="preserve">Licence Ouverte v2.0 (Etalab) : réutilisation libre sous réserve de mentionner la source.</w:t>
       </w:r>
     </w:p>
     <w:p>
@@ -1732,7 +2027,7 @@
         <w:spacing w:after="60"/>
       </w:pPr>
       <w:r>
-        <w:t xml:space="preserve">Traçabilité et auditabilité : couche BRONZE immuable, journal qualité, tests automatisés et code versionné assurent la reproductibilité complète du traitement.</w:t>
+        <w:t xml:space="preserve">Traçabilité : BRONZE immuable, journal DQM, suite dqm/, tests automatisés, code versionné.</w:t>
       </w:r>
     </w:p>
     <w:p>
@@ -1745,28 +2040,7 @@
         <w:spacing w:after="60"/>
       </w:pPr>
       <w:r>
-        <w:t xml:space="preserve">Extension future : en cas d’ajout de données d’opinion ou de flux de réseaux sociaux (potentiellement personnelles), une analyse d’impact (AIPD) préalable, la minimisation des données et une base légale documentée seraient requises.</w:t>
-      </w:r>
-    </w:p>
-    <w:p>
-      <w:pPr>
-        <w:pStyle w:val="Heading1"/>
-        <w:spacing w:after="120" w:before="240"/>
-      </w:pPr>
-      <w:r>
-        <w:rPr>
-          <w:color w:val="1B2A5E"/>
-        </w:rPr>
-        <w:t xml:space="preserve">9. Limites et axes d’amélioration</w:t>
-      </w:r>
-    </w:p>
-    <w:p>
-      <w:pPr>
-        <w:spacing w:after="120"/>
-        <w:jc w:val="both"/>
-      </w:pPr>
-      <w:r>
-        <w:t xml:space="preserve">Limites assumées : un modèle électoral fondé sur des indicateurs socio-économiques ignore les dynamiques de campagne, l’offre politique et les chocs conjoncturels ; il capte des tendances de fond, pas l’issue exacte d’un scrutin. Le POC démontre une méthode et son industrialisation, non une capacité de prévision définitive — ce point doit être explicité au client.</w:t>
+        <w:t xml:space="preserve">Secrets externalisés (.env) ; hébergement cloud UE / on-premise documentés (docs/mspr/06_rgpd_securite/).</w:t>
       </w:r>
     </w:p>
     <w:p>
@@ -1779,7 +2053,28 @@
         <w:spacing w:after="60"/>
       </w:pPr>
       <w:r>
-        <w:t xml:space="preserve">Enrichir les features : sécurité, vie associative, démographie fine, et données infra-départementales.</w:t>
+        <w:t xml:space="preserve">Extension future opinion / réseaux sociaux → AIPD préalable.</w:t>
+      </w:r>
+    </w:p>
+    <w:p>
+      <w:pPr>
+        <w:pStyle w:val="Heading1"/>
+        <w:spacing w:after="120" w:before="240"/>
+      </w:pPr>
+      <w:r>
+        <w:rPr>
+          <w:color w:val="1B2A5E"/>
+        </w:rPr>
+        <w:t xml:space="preserve">10. Limites et axes d’amélioration</w:t>
+      </w:r>
+    </w:p>
+    <w:p>
+      <w:pPr>
+        <w:spacing w:after="120"/>
+        <w:jc w:val="both"/>
+      </w:pPr>
+      <w:r>
+        <w:t xml:space="preserve">Limites assumées : un modèle socio-économique ignore campagne, offre politique et chocs conjoncturels. Le POC démontre une méthode et son industrialisation.</w:t>
       </w:r>
     </w:p>
     <w:p>
@@ -1792,7 +2087,7 @@
         <w:spacing w:after="60"/>
       </w:pPr>
       <w:r>
-        <w:t xml:space="preserve">Fiabiliser le modèle : historique électoral plus long, modèles séquentiels, calibration des probabilités et intervalles de confiance.</w:t>
+        <w:t xml:space="preserve">Enrichir les features : sécurité, démographie fine, infra-départemental.</w:t>
       </w:r>
     </w:p>
     <w:p>
@@ -1805,19 +2100,7 @@
         <w:spacing w:after="60"/>
       </w:pPr>
       <w:r>
-        <w:t xml:space="preserve">Industrialiser : orchestration Airflow, tests étendus, restitution PowerBI branchée sur la base pour les utilisateurs non techniques.</w:t>
-      </w:r>
-    </w:p>
-    <w:p>
-      <w:pPr>
-        <w:pStyle w:val="Heading1"/>
-        <w:spacing w:after="120" w:before="240"/>
-      </w:pPr>
-      <w:r>
-        <w:rPr>
-          <w:color w:val="1B2A5E"/>
-        </w:rPr>
-        <w:t xml:space="preserve">Annexe — Livrables fournis</w:t>
+        <w:t xml:space="preserve">Fiabiliser : historique plus long, modèles séquentiels, intervalles de confiance.</w:t>
       </w:r>
     </w:p>
     <w:p>
@@ -1830,7 +2113,19 @@
         <w:spacing w:after="60"/>
       </w:pPr>
       <w:r>
-        <w:t xml:space="preserve">Code complet commenté : ETL, ML, visualisations, tests, orchestrateur.</w:t>
+        <w:t xml:space="preserve">Industrialiser : Airflow en prod, Metabase branché Gold, scale-out Spark si volume.</w:t>
+      </w:r>
+    </w:p>
+    <w:p>
+      <w:pPr>
+        <w:pStyle w:val="Heading1"/>
+        <w:spacing w:after="120" w:before="240"/>
+      </w:pPr>
+      <w:r>
+        <w:rPr>
+          <w:color w:val="1B2A5E"/>
+        </w:rPr>
+        <w:t xml:space="preserve">Annexe — Livrables fournis</w:t>
       </w:r>
     </w:p>
     <w:p>
@@ -1843,7 +2138,7 @@
         <w:spacing w:after="60"/>
       </w:pPr>
       <w:r>
-        <w:t xml:space="preserve">Notebook Jupyter d’analyse exploratoire (analyse_exploratoire.ipynb).</w:t>
+        <w:t xml:space="preserve">Code complet : ETL, ML, visualisations, tests, orchestrateur, suite DQM.</w:t>
       </w:r>
     </w:p>
     <w:p>
@@ -1856,7 +2151,7 @@
         <w:spacing w:after="60"/>
       </w:pPr>
       <w:r>
-        <w:t xml:space="preserve">Jeu de données nettoyé/normalisé : base SQLite electio_poc.db + CSV GOLD.</w:t>
+        <w:t xml:space="preserve">Référentiel de données + diagrammes de flux (PNG).</w:t>
       </w:r>
     </w:p>
     <w:p>
@@ -1869,7 +2164,7 @@
         <w:spacing w:after="60"/>
       </w:pPr>
       <w:r>
-        <w:t xml:space="preserve">Schéma SQL commenté et journal qualité.</w:t>
+        <w:t xml:space="preserve">Chiffres figés (CHIFFRES_FIGES.md) + ml_report.json.</w:t>
       </w:r>
     </w:p>
     <w:p>
@@ -1882,7 +2177,20 @@
         <w:spacing w:after="60"/>
       </w:pPr>
       <w:r>
-        <w:t xml:space="preserve">Support de soutenance (PowerPoint).</w:t>
+        <w:t xml:space="preserve">Guide Metabase + schéma SQL + journal qualité.</w:t>
+      </w:r>
+    </w:p>
+    <w:p>
+      <w:pPr>
+        <w:pStyle w:val="ListParagraph"/>
+        <w:numPr>
+          <w:ilvl w:val="0"/>
+          <w:numId w:val="2"/>
+        </w:numPr>
+        <w:spacing w:after="60"/>
+      </w:pPr>
+      <w:r>
+        <w:t xml:space="preserve">Support de soutenance (PowerPoint) régénéré.</w:t>
       </w:r>
     </w:p>
     <w:sectPr>

</xml_diff>